<commit_message>
Fix multiple bookmarks won't be recognized if they're in a single run
</commit_message>
<xml_diff>
--- a/templates/health.docx
+++ b/templates/health.docx
@@ -16,15 +16,15 @@
         </w:tblCellMar>
       </w:tblPr>
       <w:tblGrid>
-        <w:gridCol w:w="4476"/>
-        <w:gridCol w:w="1867"/>
+        <w:gridCol w:w="4475"/>
+        <w:gridCol w:w="1868"/>
         <w:gridCol w:w="3303"/>
       </w:tblGrid>
       <w:tr>
         <w:trPr/>
         <w:tc>
           <w:tcPr>
-            <w:tcW w:w="4476" w:type="dxa"/>
+            <w:tcW w:w="4475" w:type="dxa"/>
             <w:tcBorders>
               <w:top w:val="single" w:sz="4" w:space="0" w:color="000000"/>
               <w:start w:val="single" w:sz="4" w:space="0" w:color="000000"/>
@@ -33,7 +33,7 @@
           </w:tcPr>
           <w:p>
             <w:pPr>
-              <w:pStyle w:val="user2"/>
+              <w:pStyle w:val="Style16"/>
               <w:bidi w:val="0"/>
               <w:spacing w:lineRule="auto" w:line="240"/>
               <w:jc w:val="center"/>
@@ -102,7 +102,7 @@
           </w:p>
           <w:p>
             <w:pPr>
-              <w:pStyle w:val="user2"/>
+              <w:pStyle w:val="Style16"/>
               <w:bidi w:val="0"/>
               <w:spacing w:lineRule="auto" w:line="240"/>
               <w:jc w:val="center"/>
@@ -134,7 +134,7 @@
           </w:p>
           <w:p>
             <w:pPr>
-              <w:pStyle w:val="user2"/>
+              <w:pStyle w:val="Style16"/>
               <w:bidi w:val="0"/>
               <w:spacing w:lineRule="auto" w:line="240"/>
               <w:jc w:val="center"/>
@@ -155,7 +155,7 @@
           </w:p>
           <w:p>
             <w:pPr>
-              <w:pStyle w:val="user2"/>
+              <w:pStyle w:val="Style16"/>
               <w:bidi w:val="0"/>
               <w:spacing w:lineRule="auto" w:line="240"/>
               <w:jc w:val="center"/>
@@ -176,7 +176,7 @@
           </w:p>
           <w:p>
             <w:pPr>
-              <w:pStyle w:val="user2"/>
+              <w:pStyle w:val="Style16"/>
               <w:bidi w:val="0"/>
               <w:spacing w:lineRule="auto" w:line="240"/>
               <w:jc w:val="center"/>
@@ -197,7 +197,7 @@
           </w:p>
           <w:p>
             <w:pPr>
-              <w:pStyle w:val="user2"/>
+              <w:pStyle w:val="Style16"/>
               <w:bidi w:val="0"/>
               <w:spacing w:lineRule="auto" w:line="240"/>
               <w:jc w:val="center"/>
@@ -218,7 +218,7 @@
           </w:p>
           <w:p>
             <w:pPr>
-              <w:pStyle w:val="user2"/>
+              <w:pStyle w:val="Style16"/>
               <w:bidi w:val="0"/>
               <w:spacing w:lineRule="auto" w:line="240"/>
               <w:jc w:val="center"/>
@@ -250,7 +250,7 @@
           </w:p>
           <w:p>
             <w:pPr>
-              <w:pStyle w:val="user2"/>
+              <w:pStyle w:val="Style16"/>
               <w:bidi w:val="0"/>
               <w:spacing w:lineRule="auto" w:line="240"/>
               <w:jc w:val="center"/>
@@ -273,7 +273,7 @@
           </w:p>
           <w:p>
             <w:pPr>
-              <w:pStyle w:val="user2"/>
+              <w:pStyle w:val="Style16"/>
               <w:bidi w:val="0"/>
               <w:spacing w:lineRule="auto" w:line="240"/>
               <w:jc w:val="center"/>
@@ -296,7 +296,7 @@
           </w:p>
           <w:p>
             <w:pPr>
-              <w:pStyle w:val="user2"/>
+              <w:pStyle w:val="Style16"/>
               <w:bidi w:val="0"/>
               <w:spacing w:lineRule="auto" w:line="240"/>
               <w:jc w:val="center"/>
@@ -354,7 +354,7 @@
           </w:p>
           <w:p>
             <w:pPr>
-              <w:pStyle w:val="user2"/>
+              <w:pStyle w:val="Style16"/>
               <w:bidi w:val="0"/>
               <w:spacing w:lineRule="auto" w:line="240"/>
               <w:jc w:val="center"/>
@@ -379,7 +379,7 @@
           </w:p>
           <w:p>
             <w:pPr>
-              <w:pStyle w:val="user2"/>
+              <w:pStyle w:val="Style16"/>
               <w:bidi w:val="0"/>
               <w:spacing w:lineRule="auto" w:line="240"/>
               <w:jc w:val="center"/>
@@ -422,7 +422,7 @@
         </w:tc>
         <w:tc>
           <w:tcPr>
-            <w:tcW w:w="1867" w:type="dxa"/>
+            <w:tcW w:w="1868" w:type="dxa"/>
             <w:tcBorders>
               <w:top w:val="single" w:sz="4" w:space="0" w:color="000000"/>
               <w:start w:val="single" w:sz="4" w:space="0" w:color="000000"/>
@@ -431,7 +431,7 @@
           </w:tcPr>
           <w:p>
             <w:pPr>
-              <w:pStyle w:val="user2"/>
+              <w:pStyle w:val="Style16"/>
               <w:bidi w:val="0"/>
               <w:spacing w:lineRule="auto" w:line="240"/>
               <w:jc w:val="start"/>
@@ -462,7 +462,7 @@
           </w:tcPr>
           <w:p>
             <w:pPr>
-              <w:pStyle w:val="user2"/>
+              <w:pStyle w:val="Style16"/>
               <w:bidi w:val="0"/>
               <w:spacing w:lineRule="auto" w:line="240"/>
               <w:jc w:val="start"/>
@@ -482,7 +482,7 @@
           </w:p>
           <w:p>
             <w:pPr>
-              <w:pStyle w:val="user2"/>
+              <w:pStyle w:val="Style16"/>
               <w:bidi w:val="0"/>
               <w:spacing w:lineRule="auto" w:line="240"/>
               <w:jc w:val="start"/>
@@ -502,7 +502,7 @@
           </w:p>
           <w:p>
             <w:pPr>
-              <w:pStyle w:val="user2"/>
+              <w:pStyle w:val="Style16"/>
               <w:bidi w:val="0"/>
               <w:spacing w:lineRule="auto" w:line="240"/>
               <w:jc w:val="start"/>
@@ -522,7 +522,7 @@
           </w:p>
           <w:p>
             <w:pPr>
-              <w:pStyle w:val="user2"/>
+              <w:pStyle w:val="Style16"/>
               <w:bidi w:val="0"/>
               <w:spacing w:lineRule="auto" w:line="240"/>
               <w:jc w:val="start"/>
@@ -542,7 +542,7 @@
           </w:p>
           <w:p>
             <w:pPr>
-              <w:pStyle w:val="user2"/>
+              <w:pStyle w:val="Style16"/>
               <w:bidi w:val="0"/>
               <w:spacing w:lineRule="auto" w:line="240"/>
               <w:jc w:val="start"/>
@@ -559,7 +559,7 @@
           </w:p>
           <w:p>
             <w:pPr>
-              <w:pStyle w:val="user2"/>
+              <w:pStyle w:val="Style16"/>
               <w:bidi w:val="0"/>
               <w:spacing w:lineRule="auto" w:line="240"/>
               <w:jc w:val="start"/>
@@ -575,7 +575,7 @@
           </w:p>
           <w:p>
             <w:pPr>
-              <w:pStyle w:val="user2"/>
+              <w:pStyle w:val="Style16"/>
               <w:bidi w:val="0"/>
               <w:spacing w:lineRule="auto" w:line="240"/>
               <w:jc w:val="start"/>
@@ -1134,8 +1134,8 @@
       <w:rFonts w:cs="Lucida Sans"/>
     </w:rPr>
   </w:style>
-  <w:style w:type="paragraph" w:styleId="user2">
-    <w:name w:val="Содержимое таблицы (user)"/>
+  <w:style w:type="paragraph" w:styleId="Style16">
+    <w:name w:val="Содержимое таблицы"/>
     <w:basedOn w:val="Normal"/>
     <w:qFormat/>
     <w:pPr>

</xml_diff>